<commit_message>
Add Unit 3051 affidavit, rejoinder, and STP execution drafts.
Includes two-part builder affidavit, Pre-EMI letter, post-hearing rejoinder, DTCP annexures, PNB folder reorganization, and payment evidence.

Co-authored-by: Cursor <cursoragent@cursor.com>
</commit_message>
<xml_diff>
--- a/Change_of_devloper_by_ATS/Reply by ATS/reply by Allotee/DTPC_HRERA_CONDITIONAL_APPROVAL/00_MASTER_CONSOLIDATED_ISSUES_LIST_COD_AND_EXECUTION_Unit_3051.docx
+++ b/Change_of_devloper_by_ATS/Reply by ATS/reply by Allotee/DTPC_HRERA_CONDITIONAL_APPROVAL/00_MASTER_CONSOLIDATED_ISSUES_LIST_COD_AND_EXECUTION_Unit_3051.docx
@@ -69,7 +69,7 @@
       <w:r>
         <w:t>From,</w:t>
         <w:br/>
-        <w:t>Prof. Vijyant Agarwal (an employee of Govt. of NCT of Delhi)</w:t>
+        <w:t>Prof. Vijyant Agarwal</w:t>
         <w:br/>
         <w:t>ATS Grandstand Phase-I, Sector 99A, Gurugram</w:t>
         <w:br/>
@@ -134,7 +134,7 @@
         <w:jc w:val="both"/>
       </w:pPr>
       <w:r>
-        <w:t>श्रीमान,</w:t>
+        <w:t>माननीय महोदय/महोदया,</w:t>
       </w:r>
     </w:p>
     <w:p>
@@ -1042,7 +1042,7 @@
         <w:jc w:val="both"/>
       </w:pPr>
       <w:r>
-        <w:t>Purpose: Working reference for cooperative requests to DTCP (certified copies, file verification, undertakings on record) — and for the allottee's own follow-up. Scope: Unit 3051 only - including Condition 12 individual notice to the undersigned Abbreviations used in this list are kindly explained in Table 1 below. Update as issues are pursued or resolved.</w:t>
+        <w:t>Purpose: Working reference for cooperative requests to DTCP (certified copies, file verification, undertakings on record) — and for the allottee's own follow-up. Scope: Unit 3051 only — including Condition 12 individual notice to the undersigned. Abbreviations used in this list are kindly explained in Table 1 below. Update as issues are pursued or resolved.</w:t>
       </w:r>
     </w:p>
     <w:p>
@@ -1058,11 +1058,6 @@
           <w:color w:val="000000"/>
           <w:sz w:val="24"/>
         </w:rPr>
-      </w:r>
-    </w:p>
-    <w:p>
-      <w:r>
-        <w:br w:type="page"/>
       </w:r>
     </w:p>
     <w:p>
@@ -4285,11 +4280,6 @@
       </w:pPr>
       <w:r>
         <w:t>This matter involves three tracks that ATS has mixed together. They must be kept distinct on the DTCP file (please see Table 2):</w:t>
-      </w:r>
-    </w:p>
-    <w:p>
-      <w:r>
-        <w:br w:type="page"/>
       </w:r>
     </w:p>
     <w:p>

</xml_diff>